<commit_message>
nuevos wwireframes y retrospectiva
</commit_message>
<xml_diff>
--- a/Docu-Entregada/Retrospectiva Sprint 1.docx
+++ b/Docu-Entregada/Retrospectiva Sprint 1.docx
@@ -6,9 +6,6 @@
       <w:pPr>
         <w:spacing w:after="60"/>
         <w:jc w:val="center"/>
-        <w:rPr>
-          <w:lang w:val="en-US"/>
-        </w:rPr>
       </w:pPr>
       <w:proofErr w:type="spellStart"/>
       <w:r>
@@ -18,7 +15,6 @@
           <w:color w:val="1F4E4C"/>
           <w:sz w:val="22"/>
           <w:szCs w:val="22"/>
-          <w:lang w:val="en-US"/>
         </w:rPr>
         <w:t>AuraHealth</w:t>
       </w:r>
@@ -28,11 +24,7 @@
       <w:pPr>
         <w:spacing w:after="100"/>
         <w:jc w:val="center"/>
-        <w:rPr>
-          <w:lang w:val="en-US"/>
-        </w:rPr>
       </w:pPr>
-      <w:proofErr w:type="spellStart"/>
       <w:r>
         <w:rPr>
           <w:b/>
@@ -40,37 +32,20 @@
           <w:color w:val="1F4E4C"/>
           <w:sz w:val="44"/>
           <w:szCs w:val="44"/>
-          <w:lang w:val="en-US"/>
         </w:rPr>
-        <w:t>Retrospectiva</w:t>
-      </w:r>
-      <w:proofErr w:type="spellEnd"/>
-      <w:r>
-        <w:rPr>
-          <w:b/>
-          <w:bCs/>
-          <w:color w:val="1F4E4C"/>
-          <w:sz w:val="44"/>
-          <w:szCs w:val="44"/>
-          <w:lang w:val="en-US"/>
-        </w:rPr>
-        <w:t xml:space="preserve"> de Sprint</w:t>
+        <w:t>Retrospectiva de Sprint</w:t>
       </w:r>
     </w:p>
     <w:p>
       <w:pPr>
         <w:spacing w:after="300"/>
         <w:jc w:val="center"/>
-        <w:rPr>
-          <w:lang w:val="en-US"/>
-        </w:rPr>
       </w:pPr>
       <w:r>
         <w:rPr>
           <w:color w:val="2E7D74"/>
           <w:sz w:val="28"/>
           <w:szCs w:val="28"/>
-          <w:lang w:val="en-US"/>
         </w:rPr>
         <w:t>Sprint 1</w:t>
       </w:r>
@@ -136,7 +111,11 @@
               <w:right w:w="120" w:type="dxa"/>
             </w:tcMar>
           </w:tcPr>
-          <w:p/>
+          <w:p>
+            <w:r>
+              <w:t>9/10/2026</w:t>
+            </w:r>
+          </w:p>
         </w:tc>
       </w:tr>
       <w:tr>
@@ -183,7 +162,11 @@
               <w:right w:w="120" w:type="dxa"/>
             </w:tcMar>
           </w:tcPr>
-          <w:p/>
+          <w:p>
+            <w:r>
+              <w:t>1h</w:t>
+            </w:r>
+          </w:p>
         </w:tc>
       </w:tr>
     </w:tbl>
@@ -301,7 +284,7 @@
     </w:p>
     <w:tbl>
       <w:tblPr>
-        <w:tblW w:w="10080" w:type="dxa"/>
+        <w:tblW w:w="9908" w:type="dxa"/>
         <w:tblBorders>
           <w:top w:val="single" w:sz="4" w:space="0" w:color="auto"/>
           <w:left w:val="single" w:sz="4" w:space="0" w:color="auto"/>
@@ -313,17 +296,17 @@
         <w:tblLook w:val="04A0" w:firstRow="1" w:lastRow="0" w:firstColumn="1" w:lastColumn="0" w:noHBand="0" w:noVBand="1"/>
       </w:tblPr>
       <w:tblGrid>
-        <w:gridCol w:w="600"/>
-        <w:gridCol w:w="5650"/>
-        <w:gridCol w:w="3830"/>
+        <w:gridCol w:w="951"/>
+        <w:gridCol w:w="8957"/>
       </w:tblGrid>
       <w:tr>
         <w:trPr>
+          <w:trHeight w:val="213"/>
           <w:tblHeader/>
         </w:trPr>
         <w:tc>
           <w:tcPr>
-            <w:tcW w:w="600" w:type="dxa"/>
+            <w:tcW w:w="951" w:type="dxa"/>
             <w:tcBorders>
               <w:top w:val="single" w:sz="4" w:space="0" w:color="2E7D74"/>
               <w:left w:val="single" w:sz="4" w:space="0" w:color="2E7D74"/>
@@ -351,7 +334,7 @@
         </w:tc>
         <w:tc>
           <w:tcPr>
-            <w:tcW w:w="5650" w:type="dxa"/>
+            <w:tcW w:w="8957" w:type="dxa"/>
             <w:tcBorders>
               <w:top w:val="single" w:sz="4" w:space="0" w:color="2E7D74"/>
               <w:left w:val="single" w:sz="4" w:space="0" w:color="2E7D74"/>
@@ -377,39 +360,14 @@
             </w:r>
           </w:p>
         </w:tc>
-        <w:tc>
-          <w:tcPr>
-            <w:tcW w:w="3830" w:type="dxa"/>
-            <w:tcBorders>
-              <w:top w:val="single" w:sz="4" w:space="0" w:color="2E7D74"/>
-              <w:left w:val="single" w:sz="4" w:space="0" w:color="2E7D74"/>
-              <w:bottom w:val="single" w:sz="4" w:space="0" w:color="2E7D74"/>
-              <w:right w:val="single" w:sz="4" w:space="0" w:color="2E7D74"/>
-            </w:tcBorders>
-            <w:shd w:val="clear" w:color="auto" w:fill="E8F3F1"/>
-            <w:tcMar>
-              <w:top w:w="100" w:type="dxa"/>
-              <w:left w:w="120" w:type="dxa"/>
-              <w:bottom w:w="100" w:type="dxa"/>
-              <w:right w:w="120" w:type="dxa"/>
-            </w:tcMar>
-          </w:tcPr>
-          <w:p>
-            <w:r>
-              <w:rPr>
-                <w:b/>
-                <w:bCs/>
-                <w:color w:val="1F4E4C"/>
-              </w:rPr>
-              <w:t>Responsable / Área</w:t>
-            </w:r>
-          </w:p>
-        </w:tc>
       </w:tr>
       <w:tr>
-        <w:tc>
-          <w:tcPr>
-            <w:tcW w:w="600" w:type="dxa"/>
+        <w:trPr>
+          <w:trHeight w:val="450"/>
+        </w:trPr>
+        <w:tc>
+          <w:tcPr>
+            <w:tcW w:w="951" w:type="dxa"/>
             <w:tcBorders>
               <w:top w:val="single" w:sz="4" w:space="0" w:color="BFBFBF"/>
               <w:left w:val="single" w:sz="4" w:space="0" w:color="BFBFBF"/>
@@ -423,11 +381,15 @@
               <w:right w:w="120" w:type="dxa"/>
             </w:tcMar>
           </w:tcPr>
-          <w:p/>
-        </w:tc>
-        <w:tc>
-          <w:tcPr>
-            <w:tcW w:w="5650" w:type="dxa"/>
+          <w:p>
+            <w:r>
+              <w:t>1</w:t>
+            </w:r>
+          </w:p>
+        </w:tc>
+        <w:tc>
+          <w:tcPr>
+            <w:tcW w:w="8957" w:type="dxa"/>
             <w:tcBorders>
               <w:top w:val="single" w:sz="4" w:space="0" w:color="BFBFBF"/>
               <w:left w:val="single" w:sz="4" w:space="0" w:color="BFBFBF"/>
@@ -441,31 +403,20 @@
               <w:right w:w="120" w:type="dxa"/>
             </w:tcMar>
           </w:tcPr>
-          <w:p/>
-        </w:tc>
-        <w:tc>
-          <w:tcPr>
-            <w:tcW w:w="3830" w:type="dxa"/>
-            <w:tcBorders>
-              <w:top w:val="single" w:sz="4" w:space="0" w:color="BFBFBF"/>
-              <w:left w:val="single" w:sz="4" w:space="0" w:color="BFBFBF"/>
-              <w:bottom w:val="single" w:sz="4" w:space="0" w:color="BFBFBF"/>
-              <w:right w:val="single" w:sz="4" w:space="0" w:color="BFBFBF"/>
-            </w:tcBorders>
-            <w:tcMar>
-              <w:top w:w="160" w:type="dxa"/>
-              <w:left w:w="120" w:type="dxa"/>
-              <w:bottom w:w="160" w:type="dxa"/>
-              <w:right w:w="120" w:type="dxa"/>
-            </w:tcMar>
-          </w:tcPr>
-          <w:p/>
+          <w:p>
+            <w:r>
+              <w:t>La planificación fue correcta. Se respetaron bien los plazos de implementación</w:t>
+            </w:r>
+          </w:p>
         </w:tc>
       </w:tr>
       <w:tr>
-        <w:tc>
-          <w:tcPr>
-            <w:tcW w:w="600" w:type="dxa"/>
+        <w:trPr>
+          <w:trHeight w:val="213"/>
+        </w:trPr>
+        <w:tc>
+          <w:tcPr>
+            <w:tcW w:w="951" w:type="dxa"/>
             <w:tcBorders>
               <w:top w:val="single" w:sz="4" w:space="0" w:color="BFBFBF"/>
               <w:left w:val="single" w:sz="4" w:space="0" w:color="BFBFBF"/>
@@ -479,11 +430,15 @@
               <w:right w:w="120" w:type="dxa"/>
             </w:tcMar>
           </w:tcPr>
-          <w:p/>
-        </w:tc>
-        <w:tc>
-          <w:tcPr>
-            <w:tcW w:w="5650" w:type="dxa"/>
+          <w:p>
+            <w:r>
+              <w:t>2</w:t>
+            </w:r>
+          </w:p>
+        </w:tc>
+        <w:tc>
+          <w:tcPr>
+            <w:tcW w:w="8957" w:type="dxa"/>
             <w:tcBorders>
               <w:top w:val="single" w:sz="4" w:space="0" w:color="BFBFBF"/>
               <w:left w:val="single" w:sz="4" w:space="0" w:color="BFBFBF"/>
@@ -497,31 +452,28 @@
               <w:right w:w="120" w:type="dxa"/>
             </w:tcMar>
           </w:tcPr>
-          <w:p/>
-        </w:tc>
-        <w:tc>
-          <w:tcPr>
-            <w:tcW w:w="3830" w:type="dxa"/>
-            <w:tcBorders>
-              <w:top w:val="single" w:sz="4" w:space="0" w:color="BFBFBF"/>
-              <w:left w:val="single" w:sz="4" w:space="0" w:color="BFBFBF"/>
-              <w:bottom w:val="single" w:sz="4" w:space="0" w:color="BFBFBF"/>
-              <w:right w:val="single" w:sz="4" w:space="0" w:color="BFBFBF"/>
-            </w:tcBorders>
-            <w:tcMar>
-              <w:top w:w="160" w:type="dxa"/>
-              <w:left w:w="120" w:type="dxa"/>
-              <w:bottom w:w="160" w:type="dxa"/>
-              <w:right w:w="120" w:type="dxa"/>
-            </w:tcMar>
-          </w:tcPr>
-          <w:p/>
+          <w:p>
+            <w:r>
+              <w:t xml:space="preserve">Los </w:t>
+            </w:r>
+            <w:proofErr w:type="spellStart"/>
+            <w:r>
+              <w:t>wireframes</w:t>
+            </w:r>
+            <w:proofErr w:type="spellEnd"/>
+            <w:r>
+              <w:t xml:space="preserve"> fueron descriptivos y permitieron una buena interpretación de cómo se debería ver la aplicación.</w:t>
+            </w:r>
+          </w:p>
         </w:tc>
       </w:tr>
       <w:tr>
-        <w:tc>
-          <w:tcPr>
-            <w:tcW w:w="600" w:type="dxa"/>
+        <w:trPr>
+          <w:trHeight w:val="224"/>
+        </w:trPr>
+        <w:tc>
+          <w:tcPr>
+            <w:tcW w:w="951" w:type="dxa"/>
             <w:tcBorders>
               <w:top w:val="single" w:sz="4" w:space="0" w:color="BFBFBF"/>
               <w:left w:val="single" w:sz="4" w:space="0" w:color="BFBFBF"/>
@@ -535,11 +487,15 @@
               <w:right w:w="120" w:type="dxa"/>
             </w:tcMar>
           </w:tcPr>
-          <w:p/>
-        </w:tc>
-        <w:tc>
-          <w:tcPr>
-            <w:tcW w:w="5650" w:type="dxa"/>
+          <w:p>
+            <w:r>
+              <w:t>3</w:t>
+            </w:r>
+          </w:p>
+        </w:tc>
+        <w:tc>
+          <w:tcPr>
+            <w:tcW w:w="8957" w:type="dxa"/>
             <w:tcBorders>
               <w:top w:val="single" w:sz="4" w:space="0" w:color="BFBFBF"/>
               <w:left w:val="single" w:sz="4" w:space="0" w:color="BFBFBF"/>
@@ -553,31 +509,20 @@
               <w:right w:w="120" w:type="dxa"/>
             </w:tcMar>
           </w:tcPr>
-          <w:p/>
-        </w:tc>
-        <w:tc>
-          <w:tcPr>
-            <w:tcW w:w="3830" w:type="dxa"/>
-            <w:tcBorders>
-              <w:top w:val="single" w:sz="4" w:space="0" w:color="BFBFBF"/>
-              <w:left w:val="single" w:sz="4" w:space="0" w:color="BFBFBF"/>
-              <w:bottom w:val="single" w:sz="4" w:space="0" w:color="BFBFBF"/>
-              <w:right w:val="single" w:sz="4" w:space="0" w:color="BFBFBF"/>
-            </w:tcBorders>
-            <w:tcMar>
-              <w:top w:w="160" w:type="dxa"/>
-              <w:left w:w="120" w:type="dxa"/>
-              <w:bottom w:w="160" w:type="dxa"/>
-              <w:right w:w="120" w:type="dxa"/>
-            </w:tcMar>
-          </w:tcPr>
-          <w:p/>
+          <w:p>
+            <w:r>
+              <w:t>Se respeto en todo momento los lineamientos propuestos por la catedra</w:t>
+            </w:r>
+          </w:p>
         </w:tc>
       </w:tr>
       <w:tr>
-        <w:tc>
-          <w:tcPr>
-            <w:tcW w:w="600" w:type="dxa"/>
+        <w:trPr>
+          <w:trHeight w:val="224"/>
+        </w:trPr>
+        <w:tc>
+          <w:tcPr>
+            <w:tcW w:w="951" w:type="dxa"/>
             <w:tcBorders>
               <w:top w:val="single" w:sz="4" w:space="0" w:color="BFBFBF"/>
               <w:left w:val="single" w:sz="4" w:space="0" w:color="BFBFBF"/>
@@ -591,11 +536,15 @@
               <w:right w:w="120" w:type="dxa"/>
             </w:tcMar>
           </w:tcPr>
-          <w:p/>
-        </w:tc>
-        <w:tc>
-          <w:tcPr>
-            <w:tcW w:w="5650" w:type="dxa"/>
+          <w:p>
+            <w:r>
+              <w:t>4</w:t>
+            </w:r>
+          </w:p>
+        </w:tc>
+        <w:tc>
+          <w:tcPr>
+            <w:tcW w:w="8957" w:type="dxa"/>
             <w:tcBorders>
               <w:top w:val="single" w:sz="4" w:space="0" w:color="BFBFBF"/>
               <w:left w:val="single" w:sz="4" w:space="0" w:color="BFBFBF"/>
@@ -609,81 +558,11 @@
               <w:right w:w="120" w:type="dxa"/>
             </w:tcMar>
           </w:tcPr>
-          <w:p/>
-        </w:tc>
-        <w:tc>
-          <w:tcPr>
-            <w:tcW w:w="3830" w:type="dxa"/>
-            <w:tcBorders>
-              <w:top w:val="single" w:sz="4" w:space="0" w:color="BFBFBF"/>
-              <w:left w:val="single" w:sz="4" w:space="0" w:color="BFBFBF"/>
-              <w:bottom w:val="single" w:sz="4" w:space="0" w:color="BFBFBF"/>
-              <w:right w:val="single" w:sz="4" w:space="0" w:color="BFBFBF"/>
-            </w:tcBorders>
-            <w:tcMar>
-              <w:top w:w="160" w:type="dxa"/>
-              <w:left w:w="120" w:type="dxa"/>
-              <w:bottom w:w="160" w:type="dxa"/>
-              <w:right w:w="120" w:type="dxa"/>
-            </w:tcMar>
-          </w:tcPr>
-          <w:p/>
-        </w:tc>
-      </w:tr>
-      <w:tr>
-        <w:tc>
-          <w:tcPr>
-            <w:tcW w:w="600" w:type="dxa"/>
-            <w:tcBorders>
-              <w:top w:val="single" w:sz="4" w:space="0" w:color="BFBFBF"/>
-              <w:left w:val="single" w:sz="4" w:space="0" w:color="BFBFBF"/>
-              <w:bottom w:val="single" w:sz="4" w:space="0" w:color="BFBFBF"/>
-              <w:right w:val="single" w:sz="4" w:space="0" w:color="BFBFBF"/>
-            </w:tcBorders>
-            <w:tcMar>
-              <w:top w:w="160" w:type="dxa"/>
-              <w:left w:w="120" w:type="dxa"/>
-              <w:bottom w:w="160" w:type="dxa"/>
-              <w:right w:w="120" w:type="dxa"/>
-            </w:tcMar>
-          </w:tcPr>
-          <w:p/>
-        </w:tc>
-        <w:tc>
-          <w:tcPr>
-            <w:tcW w:w="5650" w:type="dxa"/>
-            <w:tcBorders>
-              <w:top w:val="single" w:sz="4" w:space="0" w:color="BFBFBF"/>
-              <w:left w:val="single" w:sz="4" w:space="0" w:color="BFBFBF"/>
-              <w:bottom w:val="single" w:sz="4" w:space="0" w:color="BFBFBF"/>
-              <w:right w:val="single" w:sz="4" w:space="0" w:color="BFBFBF"/>
-            </w:tcBorders>
-            <w:tcMar>
-              <w:top w:w="160" w:type="dxa"/>
-              <w:left w:w="120" w:type="dxa"/>
-              <w:bottom w:w="160" w:type="dxa"/>
-              <w:right w:w="120" w:type="dxa"/>
-            </w:tcMar>
-          </w:tcPr>
-          <w:p/>
-        </w:tc>
-        <w:tc>
-          <w:tcPr>
-            <w:tcW w:w="3830" w:type="dxa"/>
-            <w:tcBorders>
-              <w:top w:val="single" w:sz="4" w:space="0" w:color="BFBFBF"/>
-              <w:left w:val="single" w:sz="4" w:space="0" w:color="BFBFBF"/>
-              <w:bottom w:val="single" w:sz="4" w:space="0" w:color="BFBFBF"/>
-              <w:right w:val="single" w:sz="4" w:space="0" w:color="BFBFBF"/>
-            </w:tcBorders>
-            <w:tcMar>
-              <w:top w:w="160" w:type="dxa"/>
-              <w:left w:w="120" w:type="dxa"/>
-              <w:bottom w:w="160" w:type="dxa"/>
-              <w:right w:w="120" w:type="dxa"/>
-            </w:tcMar>
-          </w:tcPr>
-          <w:p/>
+          <w:p>
+            <w:r>
+              <w:t>Luego de cada meeting con el cliente hubieron reuniones para replanificar acorde a los nuevos requerimientos.</w:t>
+            </w:r>
+          </w:p>
         </w:tc>
       </w:tr>
     </w:tbl>
@@ -905,7 +784,11 @@
               <w:right w:w="120" w:type="dxa"/>
             </w:tcMar>
           </w:tcPr>
-          <w:p/>
+          <w:p>
+            <w:r>
+              <w:t>1</w:t>
+            </w:r>
+          </w:p>
         </w:tc>
         <w:tc>
           <w:tcPr>
@@ -923,7 +806,11 @@
               <w:right w:w="120" w:type="dxa"/>
             </w:tcMar>
           </w:tcPr>
-          <w:p/>
+          <w:p>
+            <w:r>
+              <w:t>Se noto un exceso de contenido en la documentación</w:t>
+            </w:r>
+          </w:p>
         </w:tc>
         <w:tc>
           <w:tcPr>
@@ -941,7 +828,11 @@
               <w:right w:w="120" w:type="dxa"/>
             </w:tcMar>
           </w:tcPr>
-          <w:p/>
+          <w:p>
+            <w:r>
+              <w:t>Generaba una perdida en el objetivo de los entregables</w:t>
+            </w:r>
+          </w:p>
         </w:tc>
       </w:tr>
       <w:tr>
@@ -961,7 +852,11 @@
               <w:right w:w="120" w:type="dxa"/>
             </w:tcMar>
           </w:tcPr>
-          <w:p/>
+          <w:p>
+            <w:r>
+              <w:t>2</w:t>
+            </w:r>
+          </w:p>
         </w:tc>
         <w:tc>
           <w:tcPr>
@@ -979,7 +874,17 @@
               <w:right w:w="120" w:type="dxa"/>
             </w:tcMar>
           </w:tcPr>
-          <w:p/>
+          <w:p>
+            <w:r>
+              <w:t xml:space="preserve">Hubo una estimación pesimista pensando que los implementadores les tomaría </w:t>
+            </w:r>
+            <w:r>
+              <w:t>más</w:t>
+            </w:r>
+            <w:r>
+              <w:t xml:space="preserve"> tiempo puesto que no hubo una dedicación para resolver bugs como si lo habrá en el sprint 2 y 3</w:t>
+            </w:r>
+          </w:p>
         </w:tc>
         <w:tc>
           <w:tcPr>
@@ -997,7 +902,30 @@
               <w:right w:w="120" w:type="dxa"/>
             </w:tcMar>
           </w:tcPr>
-          <w:p/>
+          <w:p>
+            <w:r>
+              <w:t xml:space="preserve">Sobro tiempo el cual podría haber sido aprovechado para </w:t>
+            </w:r>
+            <w:r>
+              <w:t>más</w:t>
+            </w:r>
+            <w:r>
+              <w:t xml:space="preserve"> </w:t>
+            </w:r>
+            <w:proofErr w:type="spellStart"/>
+            <w:r>
+              <w:t>user</w:t>
+            </w:r>
+            <w:proofErr w:type="spellEnd"/>
+            <w:r>
+              <w:t xml:space="preserve"> </w:t>
+            </w:r>
+            <w:proofErr w:type="spellStart"/>
+            <w:r>
+              <w:t>stories</w:t>
+            </w:r>
+            <w:proofErr w:type="spellEnd"/>
+          </w:p>
         </w:tc>
       </w:tr>
       <w:tr>
@@ -1017,7 +945,11 @@
               <w:right w:w="120" w:type="dxa"/>
             </w:tcMar>
           </w:tcPr>
-          <w:p/>
+          <w:p>
+            <w:r>
+              <w:t>3</w:t>
+            </w:r>
+          </w:p>
         </w:tc>
         <w:tc>
           <w:tcPr>
@@ -1035,7 +967,16 @@
               <w:right w:w="120" w:type="dxa"/>
             </w:tcMar>
           </w:tcPr>
-          <w:p/>
+          <w:p>
+            <w:r>
+              <w:t xml:space="preserve">Hubo casos donde no pudimos reunirnos todos para realizar las </w:t>
+            </w:r>
+            <w:proofErr w:type="spellStart"/>
+            <w:r>
+              <w:t>dailies</w:t>
+            </w:r>
+            <w:proofErr w:type="spellEnd"/>
+          </w:p>
         </w:tc>
         <w:tc>
           <w:tcPr>
@@ -1053,119 +994,11 @@
               <w:right w:w="120" w:type="dxa"/>
             </w:tcMar>
           </w:tcPr>
-          <w:p/>
-        </w:tc>
-      </w:tr>
-      <w:tr>
-        <w:tc>
-          <w:tcPr>
-            <w:tcW w:w="600" w:type="dxa"/>
-            <w:tcBorders>
-              <w:top w:val="single" w:sz="4" w:space="0" w:color="BFBFBF"/>
-              <w:left w:val="single" w:sz="4" w:space="0" w:color="BFBFBF"/>
-              <w:bottom w:val="single" w:sz="4" w:space="0" w:color="BFBFBF"/>
-              <w:right w:val="single" w:sz="4" w:space="0" w:color="BFBFBF"/>
-            </w:tcBorders>
-            <w:tcMar>
-              <w:top w:w="160" w:type="dxa"/>
-              <w:left w:w="120" w:type="dxa"/>
-              <w:bottom w:w="160" w:type="dxa"/>
-              <w:right w:w="120" w:type="dxa"/>
-            </w:tcMar>
-          </w:tcPr>
-          <w:p/>
-        </w:tc>
-        <w:tc>
-          <w:tcPr>
-            <w:tcW w:w="5650" w:type="dxa"/>
-            <w:tcBorders>
-              <w:top w:val="single" w:sz="4" w:space="0" w:color="BFBFBF"/>
-              <w:left w:val="single" w:sz="4" w:space="0" w:color="BFBFBF"/>
-              <w:bottom w:val="single" w:sz="4" w:space="0" w:color="BFBFBF"/>
-              <w:right w:val="single" w:sz="4" w:space="0" w:color="BFBFBF"/>
-            </w:tcBorders>
-            <w:tcMar>
-              <w:top w:w="160" w:type="dxa"/>
-              <w:left w:w="120" w:type="dxa"/>
-              <w:bottom w:w="160" w:type="dxa"/>
-              <w:right w:w="120" w:type="dxa"/>
-            </w:tcMar>
-          </w:tcPr>
-          <w:p/>
-        </w:tc>
-        <w:tc>
-          <w:tcPr>
-            <w:tcW w:w="3830" w:type="dxa"/>
-            <w:tcBorders>
-              <w:top w:val="single" w:sz="4" w:space="0" w:color="BFBFBF"/>
-              <w:left w:val="single" w:sz="4" w:space="0" w:color="BFBFBF"/>
-              <w:bottom w:val="single" w:sz="4" w:space="0" w:color="BFBFBF"/>
-              <w:right w:val="single" w:sz="4" w:space="0" w:color="BFBFBF"/>
-            </w:tcBorders>
-            <w:tcMar>
-              <w:top w:w="160" w:type="dxa"/>
-              <w:left w:w="120" w:type="dxa"/>
-              <w:bottom w:w="160" w:type="dxa"/>
-              <w:right w:w="120" w:type="dxa"/>
-            </w:tcMar>
-          </w:tcPr>
-          <w:p/>
-        </w:tc>
-      </w:tr>
-      <w:tr>
-        <w:tc>
-          <w:tcPr>
-            <w:tcW w:w="600" w:type="dxa"/>
-            <w:tcBorders>
-              <w:top w:val="single" w:sz="4" w:space="0" w:color="BFBFBF"/>
-              <w:left w:val="single" w:sz="4" w:space="0" w:color="BFBFBF"/>
-              <w:bottom w:val="single" w:sz="4" w:space="0" w:color="BFBFBF"/>
-              <w:right w:val="single" w:sz="4" w:space="0" w:color="BFBFBF"/>
-            </w:tcBorders>
-            <w:tcMar>
-              <w:top w:w="160" w:type="dxa"/>
-              <w:left w:w="120" w:type="dxa"/>
-              <w:bottom w:w="160" w:type="dxa"/>
-              <w:right w:w="120" w:type="dxa"/>
-            </w:tcMar>
-          </w:tcPr>
-          <w:p/>
-        </w:tc>
-        <w:tc>
-          <w:tcPr>
-            <w:tcW w:w="5650" w:type="dxa"/>
-            <w:tcBorders>
-              <w:top w:val="single" w:sz="4" w:space="0" w:color="BFBFBF"/>
-              <w:left w:val="single" w:sz="4" w:space="0" w:color="BFBFBF"/>
-              <w:bottom w:val="single" w:sz="4" w:space="0" w:color="BFBFBF"/>
-              <w:right w:val="single" w:sz="4" w:space="0" w:color="BFBFBF"/>
-            </w:tcBorders>
-            <w:tcMar>
-              <w:top w:w="160" w:type="dxa"/>
-              <w:left w:w="120" w:type="dxa"/>
-              <w:bottom w:w="160" w:type="dxa"/>
-              <w:right w:w="120" w:type="dxa"/>
-            </w:tcMar>
-          </w:tcPr>
-          <w:p/>
-        </w:tc>
-        <w:tc>
-          <w:tcPr>
-            <w:tcW w:w="3830" w:type="dxa"/>
-            <w:tcBorders>
-              <w:top w:val="single" w:sz="4" w:space="0" w:color="BFBFBF"/>
-              <w:left w:val="single" w:sz="4" w:space="0" w:color="BFBFBF"/>
-              <w:bottom w:val="single" w:sz="4" w:space="0" w:color="BFBFBF"/>
-              <w:right w:val="single" w:sz="4" w:space="0" w:color="BFBFBF"/>
-            </w:tcBorders>
-            <w:tcMar>
-              <w:top w:w="160" w:type="dxa"/>
-              <w:left w:w="120" w:type="dxa"/>
-              <w:bottom w:w="160" w:type="dxa"/>
-              <w:right w:w="120" w:type="dxa"/>
-            </w:tcMar>
-          </w:tcPr>
-          <w:p/>
+          <w:p>
+            <w:r>
+              <w:t xml:space="preserve">Peor comunicación </w:t>
+            </w:r>
+          </w:p>
         </w:tc>
       </w:tr>
     </w:tbl>
@@ -1414,7 +1247,11 @@
               <w:right w:w="120" w:type="dxa"/>
             </w:tcMar>
           </w:tcPr>
-          <w:p/>
+          <w:p>
+            <w:r>
+              <w:t>1</w:t>
+            </w:r>
+          </w:p>
         </w:tc>
         <w:tc>
           <w:tcPr>
@@ -1432,7 +1269,11 @@
               <w:right w:w="120" w:type="dxa"/>
             </w:tcMar>
           </w:tcPr>
-          <w:p/>
+          <w:p>
+            <w:r>
+              <w:t>Reducir el contenido de los entregables a lo indispensable</w:t>
+            </w:r>
+          </w:p>
         </w:tc>
         <w:tc>
           <w:tcPr>
@@ -1450,7 +1291,11 @@
               <w:right w:w="120" w:type="dxa"/>
             </w:tcMar>
           </w:tcPr>
-          <w:p/>
+          <w:p>
+            <w:r>
+              <w:t>25/10/2026</w:t>
+            </w:r>
+          </w:p>
         </w:tc>
       </w:tr>
       <w:tr>
@@ -1473,7 +1318,11 @@
               <w:right w:w="120" w:type="dxa"/>
             </w:tcMar>
           </w:tcPr>
-          <w:p/>
+          <w:p>
+            <w:r>
+              <w:t>2</w:t>
+            </w:r>
+          </w:p>
         </w:tc>
         <w:tc>
           <w:tcPr>
@@ -1491,7 +1340,16 @@
               <w:right w:w="120" w:type="dxa"/>
             </w:tcMar>
           </w:tcPr>
-          <w:p/>
+          <w:p>
+            <w:r>
+              <w:t xml:space="preserve">Mejorar la participación en las </w:t>
+            </w:r>
+            <w:proofErr w:type="spellStart"/>
+            <w:r>
+              <w:t>dailies</w:t>
+            </w:r>
+            <w:proofErr w:type="spellEnd"/>
+          </w:p>
         </w:tc>
         <w:tc>
           <w:tcPr>
@@ -1509,320 +1367,11 @@
               <w:right w:w="120" w:type="dxa"/>
             </w:tcMar>
           </w:tcPr>
-          <w:p/>
-        </w:tc>
-      </w:tr>
-      <w:tr>
-        <w:trPr>
-          <w:trHeight w:val="246"/>
-        </w:trPr>
-        <w:tc>
-          <w:tcPr>
-            <w:tcW w:w="637" w:type="dxa"/>
-            <w:tcBorders>
-              <w:top w:val="single" w:sz="4" w:space="0" w:color="BFBFBF"/>
-              <w:left w:val="single" w:sz="4" w:space="0" w:color="BFBFBF"/>
-              <w:bottom w:val="single" w:sz="4" w:space="0" w:color="BFBFBF"/>
-              <w:right w:val="single" w:sz="4" w:space="0" w:color="BFBFBF"/>
-            </w:tcBorders>
-            <w:tcMar>
-              <w:top w:w="160" w:type="dxa"/>
-              <w:left w:w="120" w:type="dxa"/>
-              <w:bottom w:w="160" w:type="dxa"/>
-              <w:right w:w="120" w:type="dxa"/>
-            </w:tcMar>
-          </w:tcPr>
-          <w:p/>
-        </w:tc>
-        <w:tc>
-          <w:tcPr>
-            <w:tcW w:w="4758" w:type="dxa"/>
-            <w:tcBorders>
-              <w:top w:val="single" w:sz="4" w:space="0" w:color="BFBFBF"/>
-              <w:left w:val="single" w:sz="4" w:space="0" w:color="BFBFBF"/>
-              <w:bottom w:val="single" w:sz="4" w:space="0" w:color="BFBFBF"/>
-              <w:right w:val="single" w:sz="4" w:space="0" w:color="BFBFBF"/>
-            </w:tcBorders>
-            <w:tcMar>
-              <w:top w:w="160" w:type="dxa"/>
-              <w:left w:w="120" w:type="dxa"/>
-              <w:bottom w:w="160" w:type="dxa"/>
-              <w:right w:w="120" w:type="dxa"/>
-            </w:tcMar>
-          </w:tcPr>
-          <w:p/>
-        </w:tc>
-        <w:tc>
-          <w:tcPr>
-            <w:tcW w:w="2311" w:type="dxa"/>
-            <w:tcBorders>
-              <w:top w:val="single" w:sz="4" w:space="0" w:color="BFBFBF"/>
-              <w:left w:val="single" w:sz="4" w:space="0" w:color="BFBFBF"/>
-              <w:bottom w:val="single" w:sz="4" w:space="0" w:color="BFBFBF"/>
-              <w:right w:val="single" w:sz="4" w:space="0" w:color="BFBFBF"/>
-            </w:tcBorders>
-            <w:tcMar>
-              <w:top w:w="160" w:type="dxa"/>
-              <w:left w:w="120" w:type="dxa"/>
-              <w:bottom w:w="160" w:type="dxa"/>
-              <w:right w:w="120" w:type="dxa"/>
-            </w:tcMar>
-          </w:tcPr>
-          <w:p/>
-        </w:tc>
-      </w:tr>
-      <w:tr>
-        <w:trPr>
-          <w:trHeight w:val="246"/>
-        </w:trPr>
-        <w:tc>
-          <w:tcPr>
-            <w:tcW w:w="637" w:type="dxa"/>
-            <w:tcBorders>
-              <w:top w:val="single" w:sz="4" w:space="0" w:color="BFBFBF"/>
-              <w:left w:val="single" w:sz="4" w:space="0" w:color="BFBFBF"/>
-              <w:bottom w:val="single" w:sz="4" w:space="0" w:color="BFBFBF"/>
-              <w:right w:val="single" w:sz="4" w:space="0" w:color="BFBFBF"/>
-            </w:tcBorders>
-            <w:tcMar>
-              <w:top w:w="160" w:type="dxa"/>
-              <w:left w:w="120" w:type="dxa"/>
-              <w:bottom w:w="160" w:type="dxa"/>
-              <w:right w:w="120" w:type="dxa"/>
-            </w:tcMar>
-          </w:tcPr>
-          <w:p/>
-        </w:tc>
-        <w:tc>
-          <w:tcPr>
-            <w:tcW w:w="4758" w:type="dxa"/>
-            <w:tcBorders>
-              <w:top w:val="single" w:sz="4" w:space="0" w:color="BFBFBF"/>
-              <w:left w:val="single" w:sz="4" w:space="0" w:color="BFBFBF"/>
-              <w:bottom w:val="single" w:sz="4" w:space="0" w:color="BFBFBF"/>
-              <w:right w:val="single" w:sz="4" w:space="0" w:color="BFBFBF"/>
-            </w:tcBorders>
-            <w:tcMar>
-              <w:top w:w="160" w:type="dxa"/>
-              <w:left w:w="120" w:type="dxa"/>
-              <w:bottom w:w="160" w:type="dxa"/>
-              <w:right w:w="120" w:type="dxa"/>
-            </w:tcMar>
-          </w:tcPr>
-          <w:p/>
-        </w:tc>
-        <w:tc>
-          <w:tcPr>
-            <w:tcW w:w="2311" w:type="dxa"/>
-            <w:tcBorders>
-              <w:top w:val="single" w:sz="4" w:space="0" w:color="BFBFBF"/>
-              <w:left w:val="single" w:sz="4" w:space="0" w:color="BFBFBF"/>
-              <w:bottom w:val="single" w:sz="4" w:space="0" w:color="BFBFBF"/>
-              <w:right w:val="single" w:sz="4" w:space="0" w:color="BFBFBF"/>
-            </w:tcBorders>
-            <w:tcMar>
-              <w:top w:w="160" w:type="dxa"/>
-              <w:left w:w="120" w:type="dxa"/>
-              <w:bottom w:w="160" w:type="dxa"/>
-              <w:right w:w="120" w:type="dxa"/>
-            </w:tcMar>
-          </w:tcPr>
-          <w:p/>
-        </w:tc>
-      </w:tr>
-      <w:tr>
-        <w:trPr>
-          <w:trHeight w:val="234"/>
-        </w:trPr>
-        <w:tc>
-          <w:tcPr>
-            <w:tcW w:w="637" w:type="dxa"/>
-            <w:tcBorders>
-              <w:top w:val="single" w:sz="4" w:space="0" w:color="BFBFBF"/>
-              <w:left w:val="single" w:sz="4" w:space="0" w:color="BFBFBF"/>
-              <w:bottom w:val="single" w:sz="4" w:space="0" w:color="BFBFBF"/>
-              <w:right w:val="single" w:sz="4" w:space="0" w:color="BFBFBF"/>
-            </w:tcBorders>
-            <w:tcMar>
-              <w:top w:w="160" w:type="dxa"/>
-              <w:left w:w="120" w:type="dxa"/>
-              <w:bottom w:w="160" w:type="dxa"/>
-              <w:right w:w="120" w:type="dxa"/>
-            </w:tcMar>
-          </w:tcPr>
-          <w:p/>
-        </w:tc>
-        <w:tc>
-          <w:tcPr>
-            <w:tcW w:w="4758" w:type="dxa"/>
-            <w:tcBorders>
-              <w:top w:val="single" w:sz="4" w:space="0" w:color="BFBFBF"/>
-              <w:left w:val="single" w:sz="4" w:space="0" w:color="BFBFBF"/>
-              <w:bottom w:val="single" w:sz="4" w:space="0" w:color="BFBFBF"/>
-              <w:right w:val="single" w:sz="4" w:space="0" w:color="BFBFBF"/>
-            </w:tcBorders>
-            <w:tcMar>
-              <w:top w:w="160" w:type="dxa"/>
-              <w:left w:w="120" w:type="dxa"/>
-              <w:bottom w:w="160" w:type="dxa"/>
-              <w:right w:w="120" w:type="dxa"/>
-            </w:tcMar>
-          </w:tcPr>
-          <w:p/>
-        </w:tc>
-        <w:tc>
-          <w:tcPr>
-            <w:tcW w:w="2311" w:type="dxa"/>
-            <w:tcBorders>
-              <w:top w:val="single" w:sz="4" w:space="0" w:color="BFBFBF"/>
-              <w:left w:val="single" w:sz="4" w:space="0" w:color="BFBFBF"/>
-              <w:bottom w:val="single" w:sz="4" w:space="0" w:color="BFBFBF"/>
-              <w:right w:val="single" w:sz="4" w:space="0" w:color="BFBFBF"/>
-            </w:tcBorders>
-            <w:tcMar>
-              <w:top w:w="160" w:type="dxa"/>
-              <w:left w:w="120" w:type="dxa"/>
-              <w:bottom w:w="160" w:type="dxa"/>
-              <w:right w:w="120" w:type="dxa"/>
-            </w:tcMar>
-          </w:tcPr>
-          <w:p/>
-        </w:tc>
-      </w:tr>
-    </w:tbl>
-    <w:p>
-      <w:pPr>
-        <w:spacing w:after="400"/>
-      </w:pPr>
-    </w:p>
-    <w:tbl>
-      <w:tblPr>
-        <w:tblW w:w="10080" w:type="dxa"/>
-        <w:tblBorders>
-          <w:top w:val="single" w:sz="4" w:space="0" w:color="auto"/>
-          <w:left w:val="single" w:sz="4" w:space="0" w:color="auto"/>
-          <w:bottom w:val="single" w:sz="4" w:space="0" w:color="auto"/>
-          <w:right w:val="single" w:sz="4" w:space="0" w:color="auto"/>
-          <w:insideH w:val="single" w:sz="4" w:space="0" w:color="auto"/>
-          <w:insideV w:val="single" w:sz="4" w:space="0" w:color="auto"/>
-        </w:tblBorders>
-        <w:tblLook w:val="04A0" w:firstRow="1" w:lastRow="0" w:firstColumn="1" w:lastColumn="0" w:noHBand="0" w:noVBand="1"/>
-      </w:tblPr>
-      <w:tblGrid>
-        <w:gridCol w:w="10080"/>
-      </w:tblGrid>
-      <w:tr>
-        <w:tc>
-          <w:tcPr>
-            <w:tcW w:w="10080" w:type="dxa"/>
-            <w:tcBorders>
-              <w:top w:val="none" w:sz="0" w:space="0" w:color="FFFFFF"/>
-              <w:left w:val="none" w:sz="0" w:space="0" w:color="FFFFFF"/>
-              <w:bottom w:val="none" w:sz="0" w:space="0" w:color="FFFFFF"/>
-              <w:right w:val="none" w:sz="0" w:space="0" w:color="FFFFFF"/>
-            </w:tcBorders>
-            <w:shd w:val="clear" w:color="auto" w:fill="2E7D74"/>
-            <w:tcMar>
-              <w:top w:w="140" w:type="dxa"/>
-              <w:left w:w="200" w:type="dxa"/>
-              <w:bottom w:w="140" w:type="dxa"/>
-              <w:right w:w="200" w:type="dxa"/>
-            </w:tcMar>
-          </w:tcPr>
-          <w:p>
-            <w:r>
-              <w:rPr>
-                <w:b/>
-                <w:bCs/>
-                <w:color w:val="FFFFFF"/>
-                <w:sz w:val="24"/>
-                <w:szCs w:val="24"/>
-              </w:rPr>
-              <w:t>4. Comentarios adicionales</w:t>
-            </w:r>
-          </w:p>
-        </w:tc>
-      </w:tr>
-    </w:tbl>
-    <w:p>
-      <w:pPr>
-        <w:spacing w:after="120"/>
-      </w:pPr>
-    </w:p>
-    <w:tbl>
-      <w:tblPr>
-        <w:tblW w:w="10080" w:type="dxa"/>
-        <w:tblBorders>
-          <w:top w:val="single" w:sz="4" w:space="0" w:color="auto"/>
-          <w:left w:val="single" w:sz="4" w:space="0" w:color="auto"/>
-          <w:bottom w:val="single" w:sz="4" w:space="0" w:color="auto"/>
-          <w:right w:val="single" w:sz="4" w:space="0" w:color="auto"/>
-          <w:insideH w:val="single" w:sz="4" w:space="0" w:color="auto"/>
-          <w:insideV w:val="single" w:sz="4" w:space="0" w:color="auto"/>
-        </w:tblBorders>
-        <w:tblLook w:val="04A0" w:firstRow="1" w:lastRow="0" w:firstColumn="1" w:lastColumn="0" w:noHBand="0" w:noVBand="1"/>
-      </w:tblPr>
-      <w:tblGrid>
-        <w:gridCol w:w="10080"/>
-      </w:tblGrid>
-      <w:tr>
-        <w:tc>
-          <w:tcPr>
-            <w:tcW w:w="10080" w:type="dxa"/>
-            <w:tcBorders>
-              <w:top w:val="single" w:sz="4" w:space="0" w:color="BFBFBF"/>
-              <w:left w:val="single" w:sz="4" w:space="0" w:color="BFBFBF"/>
-              <w:bottom w:val="single" w:sz="4" w:space="0" w:color="BFBFBF"/>
-              <w:right w:val="single" w:sz="4" w:space="0" w:color="BFBFBF"/>
-            </w:tcBorders>
-            <w:tcMar>
-              <w:top w:w="160" w:type="dxa"/>
-              <w:left w:w="120" w:type="dxa"/>
-              <w:bottom w:w="160" w:type="dxa"/>
-              <w:right w:w="120" w:type="dxa"/>
-            </w:tcMar>
-          </w:tcPr>
-          <w:p/>
-        </w:tc>
-      </w:tr>
-      <w:tr>
-        <w:tc>
-          <w:tcPr>
-            <w:tcW w:w="10080" w:type="dxa"/>
-            <w:tcBorders>
-              <w:top w:val="single" w:sz="4" w:space="0" w:color="BFBFBF"/>
-              <w:left w:val="single" w:sz="4" w:space="0" w:color="BFBFBF"/>
-              <w:bottom w:val="single" w:sz="4" w:space="0" w:color="BFBFBF"/>
-              <w:right w:val="single" w:sz="4" w:space="0" w:color="BFBFBF"/>
-            </w:tcBorders>
-            <w:tcMar>
-              <w:top w:w="160" w:type="dxa"/>
-              <w:left w:w="120" w:type="dxa"/>
-              <w:bottom w:w="160" w:type="dxa"/>
-              <w:right w:w="120" w:type="dxa"/>
-            </w:tcMar>
-          </w:tcPr>
-          <w:p/>
-        </w:tc>
-      </w:tr>
-      <w:tr>
-        <w:tc>
-          <w:tcPr>
-            <w:tcW w:w="10080" w:type="dxa"/>
-            <w:tcBorders>
-              <w:top w:val="single" w:sz="4" w:space="0" w:color="BFBFBF"/>
-              <w:left w:val="single" w:sz="4" w:space="0" w:color="BFBFBF"/>
-              <w:bottom w:val="single" w:sz="4" w:space="0" w:color="BFBFBF"/>
-              <w:right w:val="single" w:sz="4" w:space="0" w:color="BFBFBF"/>
-            </w:tcBorders>
-            <w:tcMar>
-              <w:top w:w="160" w:type="dxa"/>
-              <w:left w:w="120" w:type="dxa"/>
-              <w:bottom w:w="160" w:type="dxa"/>
-              <w:right w:w="120" w:type="dxa"/>
-            </w:tcMar>
-          </w:tcPr>
-          <w:p/>
+          <w:p>
+            <w:r>
+              <w:t>14/10/2026</w:t>
+            </w:r>
+          </w:p>
         </w:tc>
       </w:tr>
     </w:tbl>

</xml_diff>